<commit_message>
feat: PGL price history log, HRS/CR/HDG colors, clickable admin dashboard, row-click edit (v1.5)
- Admin-only history of base PGL price changes per steel type (HRS/CR/HDG),
  downloadable as .xlsx (migration 013, new pgl-history API + settings-panel table)
- HRS/CR/HDG shown in their accent colors (orange/blue/green) in the PGL history
  table and the settings field list
- Admin dashboard tiles (offer status counts, active salespeople, total offers)
  link straight to the pre-filtered offers list / salespeople panel
- Calculator zestawienie: clicking anywhere in a line item's row (not just the
  pencil icon) opens it for editing; duplicate/delete unaffected
- Idempotency fixes for migrations 007/011 so re-running steelquote-start.ps1
  against an already-migrated local DB doesn't error
- Updated README, STAN_PROJEKTU.md, PLAN_PGL_per_typ plan status, and the
  v1.5 Word version report with all of the above

Co-Authored-By: Claude Sonnet 5 <noreply@anthropic.com>
</commit_message>
<xml_diff>
--- a/Historia wersji oraz md/Historia wersji/AMSteel_Quote_Raport_Wersji_1.5.docx
+++ b/Historia wersji oraz md/Historia wersji/AMSteel_Quote_Raport_Wersji_1.5.docx
@@ -579,7 +579,7 @@
               <w:t>Naprawiono brak synchronizacji kontaktu głównego wpisywanego w panelu „Klienci” z tabelą osób kontaktowych - dane osoby zapisane przy edycji firmy nie pojawiały się w zakładce „Kontakty”. Panel „Klienci” zyskał akcję „Kontakty” przy każdej firmie: rozwija listę zapisanych dla niej osób z możliwością edycji i usunięcia każdej z osobna oraz formularzem dodania kolejnej, bez przechodzenia do osobnej zakładki. Dodano migrację uzupełniającą kontakty zapisane, zanim ta poprawka weszła w życie.</w:t>
             </w:r>
             <w:r>
-              <w:t xml:space="preserve"> Dodano tryb „Wysoki kontrast” (przycisk obok Jasny/Ciemny, dostępny na wszystkich podstronach) - pogrubiona czcionka, większy tekst i mocno kontrastowe kolory dla handlowców pracujących na starszych lub bardzo małych ekranach.</w:t>
+              <w:t xml:space="preserve"> Dodano tryb „Wysoki kontrast” (przycisk obok Jasny/Ciemny, dostępny na wszystkich podstronach) - pogrubiona czcionka, większy tekst i mocno kontrastowe kolory dla handlowców pracujących na starszych lub bardzo małych ekranach. W tym samym okresie dodano historię zmian cen bazowych PGL z eksportem do Excela, kolorowe oznaczenia typów stali HRS/CR/HDG w panelu ustawień oraz klikalne kafelki statusów na pulpicie administratora, a w kalkulatorze kliknięcie wiersza pozycji otwiera ją do edycji.</w:t>
             </w:r>
           </w:p>
         </w:tc>
@@ -3103,6 +3103,50 @@
           </w:p>
         </w:tc>
       </w:tr>
+      <w:tr>
+        <w:tc>
+          <w:tcPr>
+            <w:tcW w:type="dxa" w:w="1948"/>
+          </w:tcPr>
+          <w:p>
+            <w:r>
+              <w:t>Nowa funkcja</w:t>
+            </w:r>
+          </w:p>
+        </w:tc>
+        <w:tc>
+          <w:tcPr>
+            <w:tcW w:type="dxa" w:w="6908"/>
+          </w:tcPr>
+          <w:p>
+            <w:r>
+              <w:t>Historia zmian cen bazowych PGL — panel ustawień administratora zapisuje teraz każdą zmianę ceny bazowej PGL osobno dla typu stali (HRS/CR/HDG): kto, kiedy i z jakiej wartości na jaką. Historia widoczna wyłącznie dla administratora, z możliwością pobrania jako plik Excel (.xlsx). Typy stali w tabeli historii oraz w samym panelu konfiguracji oznaczone kolorem (HRS pomarańczowy, CR niebieski, HDG zielony) dla szybszej orientacji.</w:t>
+            </w:r>
+          </w:p>
+        </w:tc>
+      </w:tr>
+      <w:tr>
+        <w:tc>
+          <w:tcPr>
+            <w:tcW w:type="dxa" w:w="1948"/>
+          </w:tcPr>
+          <w:p>
+            <w:r>
+              <w:t>Nowa funkcja</w:t>
+            </w:r>
+          </w:p>
+        </w:tc>
+        <w:tc>
+          <w:tcPr>
+            <w:tcW w:type="dxa" w:w="6908"/>
+          </w:tcPr>
+          <w:p>
+            <w:r>
+              <w:t>Pulpit administratora — kafelki liczby ofert wg statusu (szkic / do weryfikacji / zatwierdzona / odrzucona / wysłana), liczba aktywnych handlowców oraz łączna liczba ofert są teraz klikalne i przenoszą od razu do listy ofert przefiltrowanej po wybranym statusie (lub do panelu handlowców).</w:t>
+            </w:r>
+          </w:p>
+        </w:tc>
+      </w:tr>
     </w:tbl>
     <w:p>
       <w:pPr>
@@ -3402,6 +3446,28 @@
           </w:p>
         </w:tc>
       </w:tr>
+      <w:tr>
+        <w:tc>
+          <w:tcPr>
+            <w:tcW w:type="dxa" w:w="1948"/>
+          </w:tcPr>
+          <w:p>
+            <w:r>
+              <w:t>Nowa funkcja</w:t>
+            </w:r>
+          </w:p>
+        </w:tc>
+        <w:tc>
+          <w:tcPr>
+            <w:tcW w:type="dxa" w:w="6908"/>
+          </w:tcPr>
+          <w:p>
+            <w:r>
+              <w:t>W tabeli zestawienia w kalkulatorze kliknięcie w dowolnym miejscu wiersza pozycji (poza przyciskami akcji) otwiera ją teraz do edycji — dotychczas trzeba było trafić dokładnie w mały przycisk ołówka. Przyciski duplikowania i usuwania pozycji działają bez zmian.</w:t>
+            </w:r>
+          </w:p>
+        </w:tc>
+      </w:tr>
     </w:tbl>
     <w:p>
       <w:pPr>
@@ -3648,6 +3714,28 @@
           </w:p>
         </w:tc>
       </w:tr>
+      <w:tr>
+        <w:tc>
+          <w:tcPr>
+            <w:tcW w:type="dxa" w:w="1948"/>
+          </w:tcPr>
+          <w:p>
+            <w:r>
+              <w:t>—</w:t>
+            </w:r>
+          </w:p>
+        </w:tc>
+        <w:tc>
+          <w:tcPr>
+            <w:tcW w:type="dxa" w:w="6908"/>
+          </w:tcPr>
+          <w:p>
+            <w:r>
+              <w:t>Brak zmian w tym okresie.</w:t>
+            </w:r>
+          </w:p>
+        </w:tc>
+      </w:tr>
     </w:tbl>
     <w:p>
       <w:pPr>
@@ -3847,6 +3935,28 @@
           </w:p>
         </w:tc>
       </w:tr>
+      <w:tr>
+        <w:tc>
+          <w:tcPr>
+            <w:tcW w:type="dxa" w:w="1948"/>
+          </w:tcPr>
+          <w:p>
+            <w:r>
+              <w:t>—</w:t>
+            </w:r>
+          </w:p>
+        </w:tc>
+        <w:tc>
+          <w:tcPr>
+            <w:tcW w:type="dxa" w:w="6908"/>
+          </w:tcPr>
+          <w:p>
+            <w:r>
+              <w:t>Brak zmian w tym okresie.</w:t>
+            </w:r>
+          </w:p>
+        </w:tc>
+      </w:tr>
     </w:tbl>
     <w:p>
       <w:pPr>
@@ -4587,6 +4697,50 @@
     </w:p>
     <w:p>
       <w:pPr>
+        <w:pStyle w:val="Listapunktowana"/>
+      </w:pPr>
+      <w:proofErr w:type="spellStart"/>
+      <w:r>
+        <w:t>Migracja historii zmian cen PGL bazowego (013) nie została jeszcze uruchomiona na środowisku produkcyjnym — na razie działa tylko lokalnie.</w:t>
+      </w:r>
+      <w:proofErr w:type="spellEnd"/>
+      <w:proofErr w:type="spellStart"/>
+      <w:proofErr w:type="spellEnd"/>
+      <w:proofErr w:type="spellStart"/>
+      <w:proofErr w:type="spellEnd"/>
+      <w:proofErr w:type="spellStart"/>
+      <w:proofErr w:type="spellEnd"/>
+      <w:proofErr w:type="spellStart"/>
+      <w:proofErr w:type="spellEnd"/>
+      <w:proofErr w:type="spellStart"/>
+      <w:proofErr w:type="spellEnd"/>
+      <w:proofErr w:type="spellStart"/>
+      <w:proofErr w:type="spellEnd"/>
+      <w:proofErr w:type="spellStart"/>
+      <w:proofErr w:type="spellEnd"/>
+      <w:proofErr w:type="spellStart"/>
+      <w:proofErr w:type="spellEnd"/>
+      <w:proofErr w:type="spellStart"/>
+      <w:proofErr w:type="spellEnd"/>
+      <w:proofErr w:type="spellStart"/>
+      <w:proofErr w:type="spellEnd"/>
+      <w:proofErr w:type="spellStart"/>
+      <w:proofErr w:type="spellEnd"/>
+      <w:proofErr w:type="spellStart"/>
+      <w:proofErr w:type="spellEnd"/>
+      <w:proofErr w:type="spellStart"/>
+      <w:proofErr w:type="spellEnd"/>
+      <w:proofErr w:type="spellStart"/>
+      <w:proofErr w:type="spellEnd"/>
+      <w:proofErr w:type="spellStart"/>
+      <w:proofErr w:type="spellEnd"/>
+      <w:proofErr w:type="spellStart"/>
+      <w:proofErr w:type="spellEnd"/>
+      <w:proofErr w:type="spellStart"/>
+      <w:proofErr w:type="spellEnd"/>
+    </w:p>
+    <w:p>
+      <w:pPr>
         <w:spacing w:before="200" w:after="120"/>
       </w:pPr>
       <w:proofErr w:type="spellStart"/>
@@ -4970,6 +5124,38 @@
       <w:proofErr w:type="spellEnd"/>
       <w:r>
         <w:t>Ręczne testy nowego przepływu Klienci -&gt; Kontakty w przeglądarce: rozwinięcie firmy, dodanie, edycja i usunięcie osoby kontaktowej, potwierdzenie że kontakt pojawia się w zakładce „Kontakty”.</w:t>
+      </w:r>
+    </w:p>
+    <w:p>
+      <w:pPr>
+        <w:pStyle w:val="Listapunktowana"/>
+      </w:pPr>
+      <w:proofErr w:type="spellStart"/>
+      <w:proofErr w:type="spellEnd"/>
+      <w:proofErr w:type="spellStart"/>
+      <w:proofErr w:type="spellEnd"/>
+      <w:proofErr w:type="spellStart"/>
+      <w:proofErr w:type="spellEnd"/>
+      <w:proofErr w:type="spellStart"/>
+      <w:proofErr w:type="spellEnd"/>
+      <w:proofErr w:type="spellStart"/>
+      <w:proofErr w:type="spellEnd"/>
+      <w:proofErr w:type="spellStart"/>
+      <w:proofErr w:type="spellEnd"/>
+      <w:proofErr w:type="spellStart"/>
+      <w:proofErr w:type="spellEnd"/>
+      <w:proofErr w:type="spellStart"/>
+      <w:proofErr w:type="spellEnd"/>
+      <w:proofErr w:type="spellStart"/>
+      <w:proofErr w:type="spellEnd"/>
+      <w:proofErr w:type="spellStart"/>
+      <w:proofErr w:type="spellEnd"/>
+      <w:proofErr w:type="spellStart"/>
+      <w:proofErr w:type="spellEnd"/>
+      <w:proofErr w:type="spellStart"/>
+      <w:proofErr w:type="spellEnd"/>
+      <w:r>
+        <w:t>Uruchomić migrację historii cen PGL bazowego (013) na środowisku produkcyjnym przy najbliższym wdrożeniu.</w:t>
       </w:r>
     </w:p>
     <w:p>

</xml_diff>